<commit_message>
Update all papers and README to reflect medRxiv rejection — out of scope, not a judgment on merits
</commit_message>
<xml_diff>
--- a/biological-research/SYNTHESIS-gestational-oxygen-timing-alignment.docx
+++ b/biological-research/SYNTHESIS-gestational-oxygen-timing-alignment.docx
@@ -7147,7 +7147,21 @@
           <w:i/>
           <w:iCs/>
         </w:rPr>
-        <w:t xml:space="preserve">Manuscript prepared for medRxiv preprint submission. March 2026.</w:t>
+        <w:t xml:space="preserve">Manuscript submitted to medRxiv March 2026. Rejected as out of scope (</w:t>
+      </w:r>
+      <w:r>
+        <w:rPr>
+          <w:i/>
+          <w:iCs/>
+        </w:rPr>
+        <w:t xml:space="preserve">“not a clinical research article with new data”</w:t>
+      </w:r>
+      <w:r>
+        <w:rPr>
+          <w:i/>
+          <w:iCs/>
+        </w:rPr>
+        <w:t xml:space="preserve">). This conclusion was not a judgment on the merits of the work.</w:t>
       </w:r>
     </w:p>
     <w:bookmarkEnd w:id="55"/>

</xml_diff>